<commit_message>
fix: samakan format bold template BAST SM-PPK dengan BAST lainnya
</commit_message>
<xml_diff>
--- a/TEMPLATE_SPK_BAST/TEMPLATE_BAST_SM-PPK.docx
+++ b/TEMPLATE_SPK_BAST/TEMPLATE_BAST_SM-PPK.docx
@@ -7,6 +7,7 @@
         <w:spacing w:after="0" w:line="276" w:lineRule="auto"/>
         <w:jc w:val="center"/>
         <w:rPr>
+          <w:b/>
           <w:rFonts w:ascii="Bookman Old Style" w:hAnsi="Bookman Old Style" w:cs="Arial"/>
           <w:b/>
           <w:sz w:val="24"/>
@@ -15,6 +16,7 @@
       </w:pPr>
       <w:r>
         <w:rPr>
+          <w:b/>
           <w:rFonts w:ascii="Bookman Old Style" w:hAnsi="Bookman Old Style" w:cs="Arial"/>
           <w:b/>
           <w:sz w:val="24"/>
@@ -25,6 +27,7 @@
       </w:r>
       <w:r>
         <w:rPr>
+          <w:b/>
           <w:rFonts w:ascii="Bookman Old Style" w:hAnsi="Bookman Old Style" w:cs="Arial"/>
           <w:b/>
           <w:sz w:val="24"/>
@@ -38,8 +41,9 @@
         <w:spacing w:after="0" w:line="276" w:lineRule="auto"/>
         <w:jc w:val="center"/>
         <w:rPr>
-          <w:rFonts w:ascii="Bookman Old Style" w:hAnsi="Bookman Old Style" w:cs="Times New Roman"/>
           <w:b/>
+          <w:rFonts w:ascii="Bookman Old Style" w:hAnsi="Bookman Old Style" w:cs="Times New Roman"/>
+          <w:b/>
           <w:color w:val="000000" w:themeColor="text1"/>
           <w:sz w:val="24"/>
           <w:szCs w:val="24"/>
@@ -48,6 +52,7 @@
       </w:pPr>
       <w:r>
         <w:rPr>
+          <w:b/>
           <w:rFonts w:ascii="Bookman Old Style" w:hAnsi="Bookman Old Style" w:cs="Arial"/>
           <w:b/>
           <w:noProof/>
@@ -58,6 +63,7 @@
       </w:r>
       <w:r>
         <w:rPr>
+          <w:b/>
           <w:rFonts w:ascii="Bookman Old Style" w:hAnsi="Bookman Old Style" w:cs="Arial"/>
           <w:b/>
           <w:noProof/>
@@ -75,6 +81,7 @@
         <w:spacing w:after="0" w:line="276" w:lineRule="auto"/>
         <w:jc w:val="center"/>
         <w:rPr>
+          <w:b/>
           <w:rFonts w:ascii="Bookman Old Style" w:hAnsi="Bookman Old Style" w:cs="Arial"/>
           <w:b/>
           <w:sz w:val="24"/>
@@ -84,8 +91,9 @@
       </w:pPr>
       <w:r>
         <w:rPr>
-          <w:rFonts w:ascii="Bookman Old Style" w:hAnsi="Bookman Old Style" w:cs="Times New Roman"/>
           <w:b/>
+          <w:rFonts w:ascii="Bookman Old Style" w:hAnsi="Bookman Old Style" w:cs="Times New Roman"/>
+          <w:b/>
           <w:color w:val="000000" w:themeColor="text1"/>
           <w:sz w:val="24"/>
           <w:szCs w:val="24"/>
@@ -94,8 +102,9 @@
       </w:r>
       <w:r>
         <w:rPr>
-          <w:rFonts w:ascii="Bookman Old Style" w:hAnsi="Bookman Old Style" w:cs="Times New Roman"/>
           <w:b/>
+          <w:rFonts w:ascii="Bookman Old Style" w:hAnsi="Bookman Old Style" w:cs="Times New Roman"/>
+          <w:b/>
           <w:color w:val="000000" w:themeColor="text1"/>
           <w:sz w:val="24"/>
           <w:szCs w:val="24"/>
@@ -105,6 +114,7 @@
       </w:r>
       <w:r>
         <w:rPr>
+          <w:b/>
           <w:rFonts w:ascii="Bookman Old Style" w:hAnsi="Bookman Old Style" w:cs="Times New Roman"/>
           <w:b/>
           <w:color w:val="000000" w:themeColor="text1"/>
@@ -119,6 +129,7 @@
         <w:spacing w:after="0" w:line="276" w:lineRule="auto"/>
         <w:jc w:val="center"/>
         <w:rPr>
+          <w:b/>
           <w:rFonts w:ascii="Bookman Old Style" w:hAnsi="Bookman Old Style" w:cs="Arial"/>
           <w:b/>
           <w:sz w:val="24"/>
@@ -128,6 +139,7 @@
       </w:pPr>
       <w:r>
         <w:rPr>
+          <w:b/>
           <w:rFonts w:ascii="Bookman Old Style" w:hAnsi="Bookman Old Style" w:cs="Arial"/>
           <w:b/>
           <w:noProof/>
@@ -139,6 +151,7 @@
       </w:r>
       <w:r>
         <w:rPr>
+          <w:b/>
           <w:rFonts w:ascii="Bookman Old Style" w:hAnsi="Bookman Old Style" w:cs="Arial"/>
           <w:b/>
           <w:noProof/>
@@ -149,6 +162,7 @@
       </w:r>
       <w:r>
         <w:rPr>
+          <w:b/>
           <w:rFonts w:ascii="Bookman Old Style" w:hAnsi="Bookman Old Style" w:cs="Arial"/>
           <w:b/>
           <w:noProof/>
@@ -684,7 +698,24 @@
           <w:sz w:val="24"/>
           <w:szCs w:val="24"/>
         </w:rPr>
-        <w:t>a disebut sebagai PIHAK PERTAMA</w:t>
+        <w:t>a disebut sebagai </w:t>
+      </w:r>
+      <w:r>
+        <w:rPr>
+          <w:rFonts w:ascii="Bookman Old Style" w:hAnsi="Bookman Old Style" w:cs="Times New Roman"/>
+          <w:b/>
+          <w:sz w:val="24"/>
+          <w:szCs w:val="24"/>
+        </w:rPr>
+        <w:t>PIHAK PERTAMA</w:t>
+      </w:r>
+      <w:r>
+        <w:rPr>
+          <w:rFonts w:ascii="Bookman Old Style" w:hAnsi="Bookman Old Style" w:cs="Times New Roman"/>
+          <w:sz w:val="24"/>
+          <w:szCs w:val="24"/>
+        </w:rPr>
+        <w:t/>
       </w:r>
       <w:r>
         <w:rPr>
@@ -950,7 +981,24 @@
           <w:sz w:val="24"/>
           <w:szCs w:val="24"/>
         </w:rPr>
+        <w:t/>
+      </w:r>
+      <w:r>
+        <w:rPr>
+          <w:rFonts w:ascii="Bookman Old Style" w:hAnsi="Bookman Old Style" w:cs="Times New Roman"/>
+          <w:b/>
+          <w:sz w:val="24"/>
+          <w:szCs w:val="24"/>
+        </w:rPr>
         <w:t>PIHAK KEDUA</w:t>
+      </w:r>
+      <w:r>
+        <w:rPr>
+          <w:rFonts w:ascii="Bookman Old Style" w:hAnsi="Bookman Old Style" w:cs="Times New Roman"/>
+          <w:sz w:val="24"/>
+          <w:szCs w:val="24"/>
+        </w:rPr>
+        <w:t/>
       </w:r>
       <w:r>
         <w:rPr>
@@ -1364,6 +1412,7 @@
             <w:pPr>
               <w:jc w:val="center"/>
               <w:rPr>
+                <w:b/>
                 <w:rFonts w:ascii="Bookman Old Style" w:hAnsi="Bookman Old Style" w:cs="Times New Roman"/>
                 <w:color w:val="000000" w:themeColor="text1"/>
                 <w:sz w:val="24"/>
@@ -1372,6 +1421,7 @@
             </w:pPr>
             <w:r>
               <w:rPr>
+                <w:b/>
                 <w:rFonts w:ascii="Bookman Old Style" w:hAnsi="Bookman Old Style" w:cs="Times New Roman"/>
                 <w:color w:val="000000" w:themeColor="text1"/>
                 <w:sz w:val="24"/>
@@ -1382,6 +1432,7 @@
             </w:r>
             <w:r>
               <w:rPr>
+                <w:b/>
                 <w:rFonts w:ascii="Bookman Old Style" w:hAnsi="Bookman Old Style" w:cs="Times New Roman"/>
                 <w:color w:val="000000" w:themeColor="text1"/>
                 <w:sz w:val="24"/>
@@ -1540,6 +1591,7 @@
             <w:pPr>
               <w:jc w:val="center"/>
               <w:rPr>
+                <w:b/>
                 <w:rFonts w:ascii="Bookman Old Style" w:hAnsi="Bookman Old Style" w:cs="Times New Roman"/>
                 <w:color w:val="000000" w:themeColor="text1"/>
                 <w:sz w:val="24"/>
@@ -1548,6 +1600,7 @@
             </w:pPr>
             <w:r>
               <w:rPr>
+                <w:b/>
                 <w:rFonts w:ascii="Bookman Old Style" w:hAnsi="Bookman Old Style" w:cs="Times New Roman"/>
                 <w:color w:val="000000" w:themeColor="text1"/>
                 <w:sz w:val="24"/>
@@ -1558,6 +1611,7 @@
             </w:r>
             <w:r>
               <w:rPr>
+                <w:b/>
                 <w:rFonts w:ascii="Bookman Old Style" w:hAnsi="Bookman Old Style" w:cs="Times New Roman"/>
                 <w:color w:val="000000" w:themeColor="text1"/>
                 <w:sz w:val="24"/>

</xml_diff>